<commit_message>
adding to the dataset
</commit_message>
<xml_diff>
--- a/src/Layers/W1/BaseApp/Sales/Reports/CustomerOrderSummaryBody.docx
+++ b/src/Layers/W1/BaseApp/Sales/Reports/CustomerOrderSummaryBody.docx
@@ -29915,7 +29915,9 @@
  < / N a v W o r d R e p o r t X m l P a r t > 
 </file>
 
-<file path=customXml/item2.xml>��< ? x m l   v e r s i o n = " 1 . 0 "   e n c o d i n g = " u t f - 1 6 " ? > < N a v W o r d R e p o r t X m l P a r t   x m l n s = " u r n : m i c r o s o f t - d y n a m i c s - n a v / r e p o r t s / C u s t o m e r _ O r d e r _ S u m m a r y / 1 0 7 / " > +<file path=customXml/item2.xml>��< ? x m l   v e r s i o n = " 1 . 0 "   e n c o d i n g = " u t f - 1 6 " ? > + 
+ < N a v W o r d R e p o r t X m l P a r t   x m l n s = " u r n : m i c r o s o f t - d y n a m i c s - n a v / r e p o r t s / C u s t o m e r _ O r d e r _ S u m m a r y / 1 0 7 / " >   
      < B C R e p o r t I n f o r m a t i o n >   

</xml_diff>